<commit_message>
feat: Add extended listener fields, backup system, remote DB support
- Add new listener fields (birth date, passport, contacts, addresses, SNILS, INN)
- Add backup management system with create/restore/delete functionality
- Add remote database support (PostgreSQL, MySQL)
- Add document registration service with auto-numbering
- Update listener form with tabbed interface for personal data
- Add database configuration dialog
- Add template help with new variables documentation
- Add migration script for existing databases
</commit_message>
<xml_diff>
--- a/templates/111 от 12.11.2025 О зачислении Адм КРЧ.docx
+++ b/templates/111 от 12.11.2025 О зачислении Адм КРЧ.docx
@@ -1869,6 +1869,7 @@
     <w:p>
       <w:pPr>
         <w:spacing w:after="0" w:line="240" w:lineRule="auto"/>
+        <w:jc w:val="right"/>
         <w:rPr>
           <w:rFonts w:ascii="Times New Roman" w:eastAsia="Times New Roman" w:hAnsi="Times New Roman" w:cs="Times New Roman"/>
           <w:sz w:val="28"/>
@@ -2045,12 +2046,21 @@
         <w:spacing w:after="0" w:line="240" w:lineRule="auto"/>
         <w:jc w:val="center"/>
         <w:rPr>
+          <w:rFonts w:ascii="Times New Roman" w:hAnsi="Times New Roman" w:cs="Times New Roman"/>
+          <w:sz w:val="28"/>
+          <w:szCs w:val="28"/>
+          <w:lang w:val="en-US"/>
+        </w:rPr>
+      </w:pPr>
+      <w:r>
+        <w:rPr>
           <w:rFonts w:ascii="Times New Roman" w:eastAsia="Times New Roman" w:hAnsi="Times New Roman" w:cs="Times New Roman"/>
           <w:sz w:val="28"/>
           <w:szCs w:val="24"/>
           <w:lang w:eastAsia="ru-RU"/>
         </w:rPr>
-      </w:pPr>
+        <w:t xml:space="preserve">Список </w:t>
+      </w:r>
       <w:r>
         <w:rPr>
           <w:rFonts w:ascii="Times New Roman" w:eastAsia="Times New Roman" w:hAnsi="Times New Roman" w:cs="Times New Roman"/>
@@ -2058,7 +2068,7 @@
           <w:szCs w:val="24"/>
           <w:lang w:eastAsia="ru-RU"/>
         </w:rPr>
-        <w:t xml:space="preserve">Список </w:t>
+        <w:t>слушателей</w:t>
       </w:r>
       <w:r>
         <w:rPr>
@@ -2067,7 +2077,7 @@
           <w:szCs w:val="24"/>
           <w:lang w:eastAsia="ru-RU"/>
         </w:rPr>
-        <w:t>слушателей</w:t>
+        <w:t xml:space="preserve"> факультет</w:t>
       </w:r>
       <w:r>
         <w:rPr>
@@ -2076,7 +2086,7 @@
           <w:szCs w:val="24"/>
           <w:lang w:eastAsia="ru-RU"/>
         </w:rPr>
-        <w:t xml:space="preserve"> факультет</w:t>
+        <w:t>а</w:t>
       </w:r>
       <w:r>
         <w:rPr>
@@ -2085,7 +2095,25 @@
           <w:szCs w:val="24"/>
           <w:lang w:eastAsia="ru-RU"/>
         </w:rPr>
-        <w:t>а</w:t>
+        <w:t xml:space="preserve"> повышения квалификации и переподготовки судей, государственных гражданских служащих судов и Судебного </w:t>
+      </w:r>
+      <w:r>
+        <w:rPr>
+          <w:rFonts w:ascii="Times New Roman" w:eastAsia="Times New Roman" w:hAnsi="Times New Roman" w:cs="Times New Roman"/>
+          <w:sz w:val="28"/>
+          <w:szCs w:val="28"/>
+          <w:lang w:eastAsia="ru-RU"/>
+        </w:rPr>
+        <w:t xml:space="preserve">департамента </w:t>
+      </w:r>
+      <w:r>
+        <w:rPr>
+          <w:rFonts w:ascii="Times New Roman" w:eastAsia="Times New Roman" w:hAnsi="Times New Roman" w:cs="Times New Roman"/>
+          <w:sz w:val="28"/>
+          <w:szCs w:val="28"/>
+          <w:lang w:eastAsia="ru-RU"/>
+        </w:rPr>
+        <w:t xml:space="preserve">(ФПК судей и госслужащих судов), зачисленных на поток </w:t>
       </w:r>
       <w:r>
         <w:rPr>
@@ -2094,25 +2122,7 @@
           <w:szCs w:val="24"/>
           <w:lang w:eastAsia="ru-RU"/>
         </w:rPr>
-        <w:t xml:space="preserve"> повышения квалификации и переподготовки судей, государственных гражданских служащих судов и Судебного </w:t>
-      </w:r>
-      <w:r>
-        <w:rPr>
-          <w:rFonts w:ascii="Times New Roman" w:eastAsia="Times New Roman" w:hAnsi="Times New Roman" w:cs="Times New Roman"/>
-          <w:sz w:val="28"/>
-          <w:szCs w:val="28"/>
-          <w:lang w:eastAsia="ru-RU"/>
-        </w:rPr>
-        <w:t xml:space="preserve">департамента </w:t>
-      </w:r>
-      <w:r>
-        <w:rPr>
-          <w:rFonts w:ascii="Times New Roman" w:eastAsia="Times New Roman" w:hAnsi="Times New Roman" w:cs="Times New Roman"/>
-          <w:sz w:val="28"/>
-          <w:szCs w:val="28"/>
-          <w:lang w:eastAsia="ru-RU"/>
-        </w:rPr>
-        <w:t xml:space="preserve">(ФПК судей и госслужащих судов), зачисленных на поток </w:t>
+        <w:t>«</w:t>
       </w:r>
       <w:proofErr w:type="gramStart"/>
       <w:r>
@@ -2154,6 +2164,15 @@
         <w:rPr>
           <w:rFonts w:ascii="Times New Roman" w:eastAsia="Times New Roman" w:hAnsi="Times New Roman" w:cs="Times New Roman"/>
           <w:sz w:val="28"/>
+          <w:szCs w:val="24"/>
+          <w:lang w:eastAsia="ru-RU"/>
+        </w:rPr>
+        <w:t>»</w:t>
+      </w:r>
+      <w:r>
+        <w:rPr>
+          <w:rFonts w:ascii="Times New Roman" w:eastAsia="Times New Roman" w:hAnsi="Times New Roman" w:cs="Times New Roman"/>
+          <w:sz w:val="28"/>
           <w:szCs w:val="28"/>
           <w:lang w:eastAsia="ru-RU"/>
         </w:rPr>
@@ -2289,6 +2308,18 @@
         </w:rPr>
         <w:t xml:space="preserve"> }}</w:t>
       </w:r>
+    </w:p>
+    <w:p>
+      <w:pPr>
+        <w:spacing w:after="0" w:line="240" w:lineRule="auto"/>
+        <w:jc w:val="center"/>
+        <w:rPr>
+          <w:rFonts w:ascii="Times New Roman" w:eastAsia="Times New Roman" w:hAnsi="Times New Roman" w:cs="Times New Roman"/>
+          <w:sz w:val="28"/>
+          <w:szCs w:val="24"/>
+          <w:lang w:val="en-US" w:eastAsia="ru-RU"/>
+        </w:rPr>
+      </w:pPr>
     </w:p>
     <w:tbl>
       <w:tblPr>
@@ -2464,7 +2495,6 @@
           </w:p>
         </w:tc>
       </w:tr>
-      {% for listener in listeners %}
       <w:tr>
         <w:trPr>
           <w:trHeight w:val="397"/>
@@ -2642,7 +2672,6 @@
           </w:p>
         </w:tc>
       </w:tr>
-      {% endfor %}
     </w:tbl>
     <w:p>
       <w:pPr>

</xml_diff>